<commit_message>
Redesign job CV: modern layouts with photo injection, no experience section
Three completely distinct layouts (Contemporary/Sidebar/Bold Header) using
paragraph border-based section titles instead of colored cell backgrounds.
Photo embedded via post-render zip manipulation; removed if employee has none.
</commit_message>
<xml_diff>
--- a/backend/templates/cv_job_indigo_placeholders.docx
+++ b/backend/templates/cv_job_indigo_placeholders.docx
@@ -16,13 +16,13 @@
         <w:tblLook w:val="04A0"/>
       </w:tblPr>
       <w:tblGrid>
-        <w:gridCol w:w="2760"/>
-        <w:gridCol w:w="6878"/>
+        <w:gridCol w:w="2900"/>
+        <w:gridCol w:w="6738"/>
       </w:tblGrid>
       <w:tr>
         <w:tc>
           <w:tcPr>
-            <w:tcW w:w="2760" w:type="dxa"/>
+            <w:tcW w:w="2900" w:type="dxa"/>
             <w:shd w:val="clear" w:color="auto" w:fill="2D2170"/>
             <w:tcBorders>
               <w:top w:val="nil"/>
@@ -32,15 +32,382 @@
             </w:tcBorders>
             <w:vAlign w:val="top"/>
             <w:tcMar>
-              <w:top w:w="0" w:type="dxa"/>
-              <w:left w:w="0" w:type="dxa"/>
-              <w:bottom w:w="0" w:type="dxa"/>
-              <w:right w:w="0" w:type="dxa"/>
+              <w:top w:w="160" w:type="dxa"/>
+              <w:left w:w="200" w:type="dxa"/>
+              <w:bottom w:w="200" w:type="dxa"/>
+              <w:right w:w="200" w:type="dxa"/>
             </w:tcMar>
           </w:tcPr>
+          <w:p>
+            <w:pPr>
+              <w:spacing w:before="0" w:after="0"/>
+            </w:pPr>
+            <w:r>
+              <w:t xml:space="preserve"/>
+            </w:r>
+          </w:p>
+          <w:p>
+            <w:pPr>
+              <w:jc w:val="center"/>
+              <w:spacing w:before="0" w:after="0"/>
+            </w:pPr>
+            <w:r>
+              <w:rPr/>
+              <w:drawing>
+                <wp:inline distT="0" distB="0" distL="0" distR="0">
+                  <wp:extent cx="900000" cy="1080000"/>
+                  <wp:effectExtent l="0" t="0" r="0" b="0"/>
+                  <wp:docPr id="1" name="EmployeePhoto"/>
+                  <wp:cNvGraphicFramePr>
+                    <a:graphicFrameLocks xmlns:a="http://schemas.openxmlformats.org/drawingml/2006/main" noChangeAspect="1"/>
+                  </wp:cNvGraphicFramePr>
+                  <a:graphic xmlns:a="http://schemas.openxmlformats.org/drawingml/2006/main">
+                    <a:graphicData uri="http://schemas.openxmlformats.org/drawingml/2006/picture">
+                      <pic:pic xmlns:pic="http://schemas.openxmlformats.org/drawingml/2006/picture">
+                        <pic:nvPicPr>
+                          <pic:cNvPr id="0" name="EmployeePhoto"/>
+                          <pic:cNvPicPr>
+                            <a:picLocks noChangeAspect="1"/>
+                          </pic:cNvPicPr>
+                        </pic:nvPicPr>
+                        <pic:blipFill>
+                          <a:blip r:embed="rId_employee_photo"/>
+                          <a:stretch>
+                            <a:fillRect/>
+                          </a:stretch>
+                        </pic:blipFill>
+                        <pic:spPr>
+                          <a:xfrm>
+                            <a:off x="0" y="0"/>
+                            <a:ext cx="900000" cy="1080000"/>
+                          </a:xfrm>
+                          <a:prstGeom prst="rect">
+                            <a:avLst/>
+                          </a:prstGeom>
+                        </pic:spPr>
+                      </pic:pic>
+                    </a:graphicData>
+                  </a:graphic>
+                </wp:inline>
+              </w:drawing>
+            </w:r>
+          </w:p>
+          <w:p>
+            <w:pPr>
+              <w:spacing w:before="0" w:after="0"/>
+            </w:pPr>
+          </w:p>
+          <w:p>
+            <w:pPr>
+              <w:jc w:val="center"/>
+              <w:spacing w:before="100" w:after="20"/>
+            </w:pPr>
+            <w:r>
+              <w:rPr>
+                <w:rFonts w:ascii="Calibri" w:hAnsi="Calibri" w:cs="Calibri"/>
+                <w:b/>
+                <w:bCs/>
+                <w:color w:val="FFFFFF"/>
+                <w:sz w:val="38"/>
+                <w:szCs w:val="38"/>
+              </w:rPr>
+              <w:t xml:space="preserve">{firstName} {lastName}</w:t>
+            </w:r>
+          </w:p>
+          <w:p>
+            <w:pPr>
+              <w:jc w:val="center"/>
+              <w:spacing w:before="0" w:after="60"/>
+            </w:pPr>
+            <w:r>
+              <w:rPr>
+                <w:rFonts w:ascii="Calibri" w:hAnsi="Calibri" w:cs="Calibri"/>
+                <w:i/>
+                <w:iCs/>
+                <w:color w:val="B0BFDF"/>
+                <w:sz w:val="14"/>
+                <w:szCs w:val="14"/>
+              </w:rPr>
+              <w:t xml:space="preserve">ΒΙΟΓΡΑΦΙΚΟ ΣΗΜΕΙΩΜΑ</w:t>
+            </w:r>
+          </w:p>
+          <w:p>
+            <w:pPr>
+              <w:spacing w:before="140" w:after="50"/>
+            </w:pPr>
+            <w:r>
+              <w:rPr>
+                <w:rFonts w:ascii="Calibri" w:hAnsi="Calibri" w:cs="Calibri"/>
+                <w:b/>
+                <w:bCs/>
+                <w:color w:val="FFFFFF"/>
+                <w:sz w:val="20"/>
+                <w:szCs w:val="20"/>
+                <w:lang w:val="el-GR"/>
+              </w:rPr>
+              <w:t xml:space="preserve">ΕΠΙΚΟΙΝΩΝΙΑ</w:t>
+            </w:r>
+          </w:p>
+          <w:p>
+            <w:pPr>
+              <w:spacing w:before="40" w:after="10"/>
+            </w:pPr>
+            <w:r>
+              <w:rPr>
+                <w:rFonts w:ascii="Calibri" w:hAnsi="Calibri" w:cs="Calibri"/>
+                <w:b/>
+                <w:bCs/>
+                <w:color w:val="B0BFDF"/>
+                <w:sz w:val="16"/>
+                <w:szCs w:val="16"/>
+              </w:rPr>
+              <w:t xml:space="preserve">Email</w:t>
+            </w:r>
+          </w:p>
+          <w:p>
+            <w:pPr>
+              <w:spacing w:before="0" w:after="40"/>
+            </w:pPr>
+            <w:r>
+              <w:rPr>
+                <w:rFonts w:ascii="Calibri" w:hAnsi="Calibri" w:cs="Calibri"/>
+                <w:color w:val="FFFFFF"/>
+                <w:sz w:val="18"/>
+                <w:szCs w:val="18"/>
+              </w:rPr>
+              <w:t xml:space="preserve">{email}</w:t>
+            </w:r>
+          </w:p>
+          <w:p>
+            <w:pPr>
+              <w:spacing w:before="40" w:after="10"/>
+            </w:pPr>
+            <w:r>
+              <w:rPr>
+                <w:rFonts w:ascii="Calibri" w:hAnsi="Calibri" w:cs="Calibri"/>
+                <w:b/>
+                <w:bCs/>
+                <w:color w:val="B0BFDF"/>
+                <w:sz w:val="16"/>
+                <w:szCs w:val="16"/>
+              </w:rPr>
+              <w:t xml:space="preserve">Τηλέφωνο</w:t>
+            </w:r>
+          </w:p>
+          <w:p>
+            <w:pPr>
+              <w:spacing w:before="0" w:after="40"/>
+            </w:pPr>
+            <w:r>
+              <w:rPr>
+                <w:rFonts w:ascii="Calibri" w:hAnsi="Calibri" w:cs="Calibri"/>
+                <w:color w:val="FFFFFF"/>
+                <w:sz w:val="18"/>
+                <w:szCs w:val="18"/>
+              </w:rPr>
+              <w:t xml:space="preserve">{phone}</w:t>
+            </w:r>
+          </w:p>
+          <w:p>
+            <w:pPr>
+              <w:spacing w:before="40" w:after="10"/>
+            </w:pPr>
+            <w:r>
+              <w:rPr>
+                <w:rFonts w:ascii="Calibri" w:hAnsi="Calibri" w:cs="Calibri"/>
+                <w:b/>
+                <w:bCs/>
+                <w:color w:val="B0BFDF"/>
+                <w:sz w:val="16"/>
+                <w:szCs w:val="16"/>
+              </w:rPr>
+              <w:t xml:space="preserve">Διεύθυνση</w:t>
+            </w:r>
+          </w:p>
+          <w:p>
+            <w:pPr>
+              <w:spacing w:before="0" w:after="40"/>
+            </w:pPr>
+            <w:r>
+              <w:rPr>
+                <w:rFonts w:ascii="Calibri" w:hAnsi="Calibri" w:cs="Calibri"/>
+                <w:color w:val="FFFFFF"/>
+                <w:sz w:val="18"/>
+                <w:szCs w:val="18"/>
+              </w:rPr>
+              <w:t xml:space="preserve">{homeAddress}</w:t>
+            </w:r>
+          </w:p>
+          <w:p>
+            <w:pPr>
+              <w:spacing w:before="140" w:after="50"/>
+            </w:pPr>
+            <w:r>
+              <w:rPr>
+                <w:rFonts w:ascii="Calibri" w:hAnsi="Calibri" w:cs="Calibri"/>
+                <w:b/>
+                <w:bCs/>
+                <w:color w:val="FFFFFF"/>
+                <w:sz w:val="20"/>
+                <w:szCs w:val="20"/>
+                <w:lang w:val="el-GR"/>
+              </w:rPr>
+              <w:t xml:space="preserve">ΠΡΟΣΩΠΙΚΑ</w:t>
+            </w:r>
+          </w:p>
+          <w:p>
+            <w:pPr>
+              <w:spacing w:before="40" w:after="10"/>
+            </w:pPr>
+            <w:r>
+              <w:rPr>
+                <w:rFonts w:ascii="Calibri" w:hAnsi="Calibri" w:cs="Calibri"/>
+                <w:b/>
+                <w:bCs/>
+                <w:color w:val="B0BFDF"/>
+                <w:sz w:val="16"/>
+                <w:szCs w:val="16"/>
+              </w:rPr>
+              <w:t xml:space="preserve">Ημ. Γέννησης</w:t>
+            </w:r>
+          </w:p>
+          <w:p>
+            <w:pPr>
+              <w:spacing w:before="0" w:after="40"/>
+            </w:pPr>
+            <w:r>
+              <w:rPr>
+                <w:rFonts w:ascii="Calibri" w:hAnsi="Calibri" w:cs="Calibri"/>
+                <w:color w:val="FFFFFF"/>
+                <w:sz w:val="18"/>
+                <w:szCs w:val="18"/>
+              </w:rPr>
+              <w:t xml:space="preserve">{dateOfBirth}</w:t>
+            </w:r>
+          </w:p>
+          <w:p>
+            <w:pPr>
+              <w:spacing w:before="40" w:after="10"/>
+            </w:pPr>
+            <w:r>
+              <w:rPr>
+                <w:rFonts w:ascii="Calibri" w:hAnsi="Calibri" w:cs="Calibri"/>
+                <w:b/>
+                <w:bCs/>
+                <w:color w:val="B0BFDF"/>
+                <w:sz w:val="16"/>
+                <w:szCs w:val="16"/>
+              </w:rPr>
+              <w:t xml:space="preserve">Τόπος Γέν.</w:t>
+            </w:r>
+          </w:p>
+          <w:p>
+            <w:pPr>
+              <w:spacing w:before="0" w:after="40"/>
+            </w:pPr>
+            <w:r>
+              <w:rPr>
+                <w:rFonts w:ascii="Calibri" w:hAnsi="Calibri" w:cs="Calibri"/>
+                <w:color w:val="FFFFFF"/>
+                <w:sz w:val="18"/>
+                <w:szCs w:val="18"/>
+              </w:rPr>
+              <w:t xml:space="preserve">{placeOfBirth}</w:t>
+            </w:r>
+          </w:p>
+          <w:p>
+            <w:pPr>
+              <w:spacing w:before="40" w:after="10"/>
+            </w:pPr>
+            <w:r>
+              <w:rPr>
+                <w:rFonts w:ascii="Calibri" w:hAnsi="Calibri" w:cs="Calibri"/>
+                <w:b/>
+                <w:bCs/>
+                <w:color w:val="B0BFDF"/>
+                <w:sz w:val="16"/>
+                <w:szCs w:val="16"/>
+              </w:rPr>
+              <w:t xml:space="preserve">Πατρώνυμο</w:t>
+            </w:r>
+          </w:p>
+          <w:p>
+            <w:pPr>
+              <w:spacing w:before="0" w:after="40"/>
+            </w:pPr>
+            <w:r>
+              <w:rPr>
+                <w:rFonts w:ascii="Calibri" w:hAnsi="Calibri" w:cs="Calibri"/>
+                <w:color w:val="FFFFFF"/>
+                <w:sz w:val="18"/>
+                <w:szCs w:val="18"/>
+              </w:rPr>
+              <w:t xml:space="preserve">{fatherName}</w:t>
+            </w:r>
+          </w:p>
+          <w:p>
+            <w:pPr>
+              <w:spacing w:before="40" w:after="10"/>
+            </w:pPr>
+            <w:r>
+              <w:rPr>
+                <w:rFonts w:ascii="Calibri" w:hAnsi="Calibri" w:cs="Calibri"/>
+                <w:b/>
+                <w:bCs/>
+                <w:color w:val="B0BFDF"/>
+                <w:sz w:val="16"/>
+                <w:szCs w:val="16"/>
+              </w:rPr>
+              <w:t xml:space="preserve">Μητρώνυμο</w:t>
+            </w:r>
+          </w:p>
+          <w:p>
+            <w:pPr>
+              <w:spacing w:before="0" w:after="40"/>
+            </w:pPr>
+            <w:r>
+              <w:rPr>
+                <w:rFonts w:ascii="Calibri" w:hAnsi="Calibri" w:cs="Calibri"/>
+                <w:color w:val="FFFFFF"/>
+                <w:sz w:val="18"/>
+                <w:szCs w:val="18"/>
+              </w:rPr>
+              <w:t xml:space="preserve">{motherName}</w:t>
+            </w:r>
+          </w:p>
+          <w:p>
+            <w:pPr>
+              <w:spacing w:before="0" w:after="0"/>
+            </w:pPr>
+            <w:r>
+              <w:rPr>
+                <w:color w:val="FFFFFF"/>
+                <w:sz w:val="2"/>
+                <w:szCs w:val="2"/>
+              </w:rPr>
+              <w:t>{#hasLanguages}</w:t>
+            </w:r>
+          </w:p>
+          <w:p>
+            <w:pPr>
+              <w:spacing w:before="140" w:after="50"/>
+            </w:pPr>
+            <w:r>
+              <w:rPr>
+                <w:rFonts w:ascii="Calibri" w:hAnsi="Calibri" w:cs="Calibri"/>
+                <w:b/>
+                <w:bCs/>
+                <w:color w:val="FFFFFF"/>
+                <w:sz w:val="20"/>
+                <w:szCs w:val="20"/>
+                <w:lang w:val="el-GR"/>
+              </w:rPr>
+              <w:t xml:space="preserve">ΓΛΩΣΣΕΣ</w:t>
+            </w:r>
+          </w:p>
           <w:tbl>
             <w:tblPr>
-              <w:tblW w:w="2760" w:type="dxa"/>
+              <w:tblW w:w="2580" w:type="dxa"/>
               <w:tblBorders>
                 <w:top w:val="nil"/>
                 <w:left w:val="nil"/>
@@ -52,13 +419,12 @@
               <w:tblLook w:val="04A0"/>
             </w:tblPr>
             <w:tblGrid>
-              <w:gridCol w:w="2760"/>
+              <w:gridCol w:w="2580"/>
             </w:tblGrid>
             <w:tr>
               <w:tc>
                 <w:tcPr>
-                  <w:tcW w:w="2760" w:type="dxa"/>
-                  <w:shd w:val="clear" w:color="auto" w:fill="2D2170"/>
+                  <w:tcW w:w="2580" w:type="dxa"/>
                   <w:tcBorders>
                     <w:top w:val="nil"/>
                     <w:left w:val="nil"/>
@@ -67,30 +433,28 @@
                   </w:tcBorders>
                   <w:tcMar>
                     <w:top w:w="0" w:type="dxa"/>
-                    <w:left w:w="160" w:type="dxa"/>
+                    <w:left w:w="0" w:type="dxa"/>
                     <w:bottom w:w="0" w:type="dxa"/>
-                    <w:right w:w="160" w:type="dxa"/>
+                    <w:right w:w="0" w:type="dxa"/>
                   </w:tcMar>
                 </w:tcPr>
                 <w:p>
                   <w:pPr>
-                    <w:spacing w:before="160" w:after="60"/>
+                    <w:spacing w:before="40" w:after="10"/>
                   </w:pPr>
                   <w:r>
                     <w:rPr>
                       <w:rFonts w:ascii="Calibri" w:hAnsi="Calibri" w:cs="Calibri"/>
-                      <w:b/>
-                      <w:bCs/>
                       <w:color w:val="FFFFFF"/>
-                      <w:sz w:val="36"/>
-                      <w:szCs w:val="36"/>
+                      <w:sz w:val="18"/>
+                      <w:szCs w:val="18"/>
                     </w:rPr>
-                    <w:t xml:space="preserve">{firstName} {lastName}</w:t>
+                    <w:t xml:space="preserve">{#languageRows}{language}</w:t>
                   </w:r>
                 </w:p>
                 <w:p>
                   <w:pPr>
-                    <w:spacing w:before="0" w:after="160"/>
+                    <w:spacing w:before="0" w:after="5"/>
                   </w:pPr>
                   <w:r>
                     <w:rPr>
@@ -99,495 +463,19 @@
                       <w:sz w:val="16"/>
                       <w:szCs w:val="16"/>
                     </w:rPr>
-                    <w:t xml:space="preserve">ΒΙΟΓΡΑΦΙΚΟ ΣΗΜΕΙΩΜΑ</w:t>
+                    <w:t xml:space="preserve">{degreeTitle}</w:t>
                   </w:r>
                 </w:p>
-              </w:tc>
-            </w:tr>
-            <w:tr>
-              <w:tc>
-                <w:tcPr>
-                  <w:tcW w:w="2760" w:type="dxa"/>
-                  <w:shd w:val="clear" w:color="auto" w:fill="2D2170"/>
-                  <w:tcBorders>
-                    <w:top w:val="nil"/>
-                    <w:left w:val="nil"/>
-                    <w:bottom w:val="nil"/>
-                    <w:right w:val="nil"/>
-                  </w:tcBorders>
-                  <w:tcMar>
-                    <w:top w:w="0" w:type="dxa"/>
-                    <w:left w:w="160" w:type="dxa"/>
-                    <w:bottom w:w="0" w:type="dxa"/>
-                    <w:right w:w="160" w:type="dxa"/>
-                  </w:tcMar>
-                </w:tcPr>
                 <w:p>
                   <w:pPr>
-                    <w:spacing w:before="120" w:after="40"/>
+                    <w:spacing w:before="0" w:after="30"/>
                   </w:pPr>
                   <w:r>
                     <w:rPr>
                       <w:rFonts w:ascii="Calibri" w:hAnsi="Calibri" w:cs="Calibri"/>
-                      <w:b/>
-                      <w:bCs/>
-                      <w:color w:val="FFFFFF"/>
-                      <w:sz w:val="18"/>
-                      <w:szCs w:val="18"/>
-                    </w:rPr>
-                    <w:t xml:space="preserve">ΕΠΙΚΟΙΝΩΝΙΑ</w:t>
-                  </w:r>
-                </w:p>
-                <w:p>
-                  <w:pPr>
-                    <w:spacing w:before="40" w:after="20"/>
-                  </w:pPr>
-                  <w:r>
-                    <w:rPr>
-                      <w:rFonts w:ascii="Calibri" w:hAnsi="Calibri" w:cs="Calibri"/>
-                      <w:b/>
-                      <w:bCs/>
-                      <w:color w:val="C8D4F0"/>
-                      <w:sz w:val="16"/>
-                      <w:szCs w:val="16"/>
-                    </w:rPr>
-                    <w:t xml:space="preserve">Τηλέφωνο</w:t>
-                  </w:r>
-                </w:p>
-                <w:p>
-                  <w:pPr>
-                    <w:spacing w:before="0" w:after="40"/>
-                  </w:pPr>
-                  <w:r>
-                    <w:rPr>
-                      <w:rFonts w:ascii="Calibri" w:hAnsi="Calibri" w:cs="Calibri"/>
-                      <w:color w:val="FFFFFF"/>
-                      <w:sz w:val="18"/>
-                      <w:szCs w:val="18"/>
-                    </w:rPr>
-                    <w:t xml:space="preserve">{phone}</w:t>
-                  </w:r>
-                </w:p>
-                <w:p>
-                  <w:pPr>
-                    <w:spacing w:before="40" w:after="20"/>
-                  </w:pPr>
-                  <w:r>
-                    <w:rPr>
-                      <w:rFonts w:ascii="Calibri" w:hAnsi="Calibri" w:cs="Calibri"/>
-                      <w:b/>
-                      <w:bCs/>
-                      <w:color w:val="C8D4F0"/>
-                      <w:sz w:val="16"/>
-                      <w:szCs w:val="16"/>
-                    </w:rPr>
-                    <w:t xml:space="preserve">Email</w:t>
-                  </w:r>
-                </w:p>
-                <w:p>
-                  <w:pPr>
-                    <w:spacing w:before="0" w:after="40"/>
-                  </w:pPr>
-                  <w:r>
-                    <w:rPr>
-                      <w:rFonts w:ascii="Calibri" w:hAnsi="Calibri" w:cs="Calibri"/>
-                      <w:color w:val="FFFFFF"/>
-                      <w:sz w:val="18"/>
-                      <w:szCs w:val="18"/>
-                    </w:rPr>
-                    <w:t xml:space="preserve">{email}</w:t>
-                  </w:r>
-                </w:p>
-                <w:p>
-                  <w:pPr>
-                    <w:spacing w:before="40" w:after="20"/>
-                  </w:pPr>
-                  <w:r>
-                    <w:rPr>
-                      <w:rFonts w:ascii="Calibri" w:hAnsi="Calibri" w:cs="Calibri"/>
-                      <w:b/>
-                      <w:bCs/>
-                      <w:color w:val="C8D4F0"/>
-                      <w:sz w:val="16"/>
-                      <w:szCs w:val="16"/>
-                    </w:rPr>
-                    <w:t xml:space="preserve">Διεύθυνση</w:t>
-                  </w:r>
-                </w:p>
-                <w:p>
-                  <w:pPr>
-                    <w:spacing w:before="0" w:after="40"/>
-                  </w:pPr>
-                  <w:r>
-                    <w:rPr>
-                      <w:rFonts w:ascii="Calibri" w:hAnsi="Calibri" w:cs="Calibri"/>
-                      <w:color w:val="FFFFFF"/>
-                      <w:sz w:val="18"/>
-                      <w:szCs w:val="18"/>
-                    </w:rPr>
-                    <w:t xml:space="preserve">{homeAddress}</w:t>
-                  </w:r>
-                </w:p>
-              </w:tc>
-            </w:tr>
-            <w:tr>
-              <w:tc>
-                <w:tcPr>
-                  <w:tcW w:w="2760" w:type="dxa"/>
-                  <w:shd w:val="clear" w:color="auto" w:fill="2D2170"/>
-                  <w:tcBorders>
-                    <w:top w:val="nil"/>
-                    <w:left w:val="nil"/>
-                    <w:bottom w:val="nil"/>
-                    <w:right w:val="nil"/>
-                  </w:tcBorders>
-                  <w:tcMar>
-                    <w:top w:w="0" w:type="dxa"/>
-                    <w:left w:w="160" w:type="dxa"/>
-                    <w:bottom w:w="0" w:type="dxa"/>
-                    <w:right w:w="160" w:type="dxa"/>
-                  </w:tcMar>
-                </w:tcPr>
-                <w:p>
-                  <w:pPr>
-                    <w:spacing w:before="120" w:after="40"/>
-                  </w:pPr>
-                  <w:r>
-                    <w:rPr>
-                      <w:rFonts w:ascii="Calibri" w:hAnsi="Calibri" w:cs="Calibri"/>
-                      <w:b/>
-                      <w:bCs/>
-                      <w:color w:val="FFFFFF"/>
-                      <w:sz w:val="18"/>
-                      <w:szCs w:val="18"/>
-                    </w:rPr>
-                    <w:t xml:space="preserve">ΠΡΟΣΩΠΙΚΑ ΣΤΟΙΧΕΙΑ</w:t>
-                  </w:r>
-                </w:p>
-                <w:p>
-                  <w:pPr>
-                    <w:spacing w:before="40" w:after="20"/>
-                  </w:pPr>
-                  <w:r>
-                    <w:rPr>
-                      <w:rFonts w:ascii="Calibri" w:hAnsi="Calibri" w:cs="Calibri"/>
-                      <w:b/>
-                      <w:bCs/>
-                      <w:color w:val="C8D4F0"/>
-                      <w:sz w:val="16"/>
-                      <w:szCs w:val="16"/>
-                    </w:rPr>
-                    <w:t xml:space="preserve">Πατρώνυμο</w:t>
-                  </w:r>
-                </w:p>
-                <w:p>
-                  <w:pPr>
-                    <w:spacing w:before="0" w:after="40"/>
-                  </w:pPr>
-                  <w:r>
-                    <w:rPr>
-                      <w:rFonts w:ascii="Calibri" w:hAnsi="Calibri" w:cs="Calibri"/>
-                      <w:color w:val="FFFFFF"/>
-                      <w:sz w:val="18"/>
-                      <w:szCs w:val="18"/>
-                    </w:rPr>
-                    <w:t xml:space="preserve">{fatherName}</w:t>
-                  </w:r>
-                </w:p>
-                <w:p>
-                  <w:pPr>
-                    <w:spacing w:before="40" w:after="20"/>
-                  </w:pPr>
-                  <w:r>
-                    <w:rPr>
-                      <w:rFonts w:ascii="Calibri" w:hAnsi="Calibri" w:cs="Calibri"/>
-                      <w:b/>
-                      <w:bCs/>
-                      <w:color w:val="C8D4F0"/>
-                      <w:sz w:val="16"/>
-                      <w:szCs w:val="16"/>
-                    </w:rPr>
-                    <w:t xml:space="preserve">Μητρώνυμο</w:t>
-                  </w:r>
-                </w:p>
-                <w:p>
-                  <w:pPr>
-                    <w:spacing w:before="0" w:after="40"/>
-                  </w:pPr>
-                  <w:r>
-                    <w:rPr>
-                      <w:rFonts w:ascii="Calibri" w:hAnsi="Calibri" w:cs="Calibri"/>
-                      <w:color w:val="FFFFFF"/>
-                      <w:sz w:val="18"/>
-                      <w:szCs w:val="18"/>
-                    </w:rPr>
-                    <w:t xml:space="preserve">{motherName}</w:t>
-                  </w:r>
-                </w:p>
-                <w:p>
-                  <w:pPr>
-                    <w:spacing w:before="40" w:after="20"/>
-                  </w:pPr>
-                  <w:r>
-                    <w:rPr>
-                      <w:rFonts w:ascii="Calibri" w:hAnsi="Calibri" w:cs="Calibri"/>
-                      <w:b/>
-                      <w:bCs/>
-                      <w:color w:val="C8D4F0"/>
-                      <w:sz w:val="16"/>
-                      <w:szCs w:val="16"/>
-                    </w:rPr>
-                    <w:t xml:space="preserve">Ημ. Γέννησης</w:t>
-                  </w:r>
-                </w:p>
-                <w:p>
-                  <w:pPr>
-                    <w:spacing w:before="0" w:after="40"/>
-                  </w:pPr>
-                  <w:r>
-                    <w:rPr>
-                      <w:rFonts w:ascii="Calibri" w:hAnsi="Calibri" w:cs="Calibri"/>
-                      <w:color w:val="FFFFFF"/>
-                      <w:sz w:val="18"/>
-                      <w:szCs w:val="18"/>
-                    </w:rPr>
-                    <w:t xml:space="preserve">{dateOfBirth}</w:t>
-                  </w:r>
-                </w:p>
-                <w:p>
-                  <w:pPr>
-                    <w:spacing w:before="40" w:after="20"/>
-                  </w:pPr>
-                  <w:r>
-                    <w:rPr>
-                      <w:rFonts w:ascii="Calibri" w:hAnsi="Calibri" w:cs="Calibri"/>
-                      <w:b/>
-                      <w:bCs/>
-                      <w:color w:val="C8D4F0"/>
-                      <w:sz w:val="16"/>
-                      <w:szCs w:val="16"/>
-                    </w:rPr>
-                    <w:t xml:space="preserve">Τόπος Γέν.</w:t>
-                  </w:r>
-                </w:p>
-                <w:p>
-                  <w:pPr>
-                    <w:spacing w:before="0" w:after="40"/>
-                  </w:pPr>
-                  <w:r>
-                    <w:rPr>
-                      <w:rFonts w:ascii="Calibri" w:hAnsi="Calibri" w:cs="Calibri"/>
-                      <w:color w:val="FFFFFF"/>
-                      <w:sz w:val="18"/>
-                      <w:szCs w:val="18"/>
-                    </w:rPr>
-                    <w:t xml:space="preserve">{placeOfBirth}</w:t>
-                  </w:r>
-                </w:p>
-              </w:tc>
-            </w:tr>
-          </w:tbl>
-          <w:p>
-            <w:pPr>
-              <w:spacing w:before="0" w:after="0"/>
-            </w:pPr>
-            <w:r>
-              <w:rPr>
-                <w:rFonts w:ascii="Calibri" w:hAnsi="Calibri" w:cs="Calibri"/>
-                <w:color w:val="FFFFFF"/>
-                <w:sz w:val="2"/>
-                <w:szCs w:val="2"/>
-              </w:rPr>
-              <w:t xml:space="preserve">{#hasLanguages}</w:t>
-            </w:r>
-          </w:p>
-          <w:p>
-            <w:pPr>
-              <w:spacing w:before="0" w:after="0"/>
-            </w:pPr>
-          </w:p>
-          <w:tbl>
-            <w:tblPr>
-              <w:tblW w:w="2760" w:type="dxa"/>
-              <w:tblBorders>
-                <w:top w:val="nil"/>
-                <w:left w:val="nil"/>
-                <w:bottom w:val="nil"/>
-                <w:right w:val="nil"/>
-                <w:insideH w:val="nil"/>
-                <w:insideV w:val="nil"/>
-              </w:tblBorders>
-              <w:tblLook w:val="04A0"/>
-            </w:tblPr>
-            <w:tblGrid>
-              <w:gridCol w:w="1518"/>
-              <w:gridCol w:w="1242"/>
-            </w:tblGrid>
-            <w:tr>
-              <w:tc>
-                <w:tcPr>
-                  <w:tcW w:w="2760" w:type="dxa"/>
-                  <w:gridSpan w:val="2"/>
-                  <w:shd w:val="clear" w:color="auto" w:fill="2D2170"/>
-                  <w:tcBorders>
-                    <w:top w:val="nil"/>
-                    <w:left w:val="nil"/>
-                    <w:bottom w:val="nil"/>
-                    <w:right w:val="nil"/>
-                  </w:tcBorders>
-                  <w:tcMar>
-                    <w:top w:w="40" w:type="dxa"/>
-                    <w:left w:w="160" w:type="dxa"/>
-                    <w:bottom w:w="40" w:type="dxa"/>
-                    <w:right w:w="160" w:type="dxa"/>
-                  </w:tcMar>
-                </w:tcPr>
-                <w:p>
-                  <w:pPr>
-                    <w:spacing w:before="80" w:after="80"/>
-                  </w:pPr>
-                  <w:r>
-                    <w:rPr>
-                      <w:rFonts w:ascii="Calibri" w:hAnsi="Calibri" w:cs="Calibri"/>
-                      <w:b/>
-                      <w:bCs/>
-                      <w:color w:val="FFFFFF"/>
-                      <w:sz w:val="18"/>
-                      <w:szCs w:val="18"/>
-                    </w:rPr>
-                    <w:t xml:space="preserve">ΓΛΩΣΣΕΣ</w:t>
-                  </w:r>
-                </w:p>
-              </w:tc>
-            </w:tr>
-            <w:tr>
-              <w:tc>
-                <w:tcPr>
-                  <w:tcW w:w="1518" w:type="dxa"/>
-                  <w:shd w:val="clear" w:color="auto" w:fill="2D2170"/>
-                  <w:tcBorders>
-                    <w:top w:val="nil"/>
-                    <w:left w:val="nil"/>
-                    <w:bottom w:val="nil"/>
-                    <w:right w:val="nil"/>
-                  </w:tcBorders>
-                  <w:tcMar>
-                    <w:top w:w="0" w:type="dxa"/>
-                    <w:left w:w="160" w:type="dxa"/>
-                    <w:bottom w:w="0" w:type="dxa"/>
-                    <w:right w:w="80" w:type="dxa"/>
-                  </w:tcMar>
-                </w:tcPr>
-                <w:p>
-                  <w:pPr>
-                    <w:spacing w:before="30" w:after="30"/>
-                  </w:pPr>
-                  <w:r>
-                    <w:rPr>
-                      <w:rFonts w:ascii="Calibri" w:hAnsi="Calibri" w:cs="Calibri"/>
-                      <w:b/>
-                      <w:bCs/>
-                      <w:color w:val="B0BFDF"/>
-                      <w:sz w:val="16"/>
-                      <w:szCs w:val="16"/>
-                    </w:rPr>
-                    <w:t xml:space="preserve">Γλώσσα</w:t>
-                  </w:r>
-                </w:p>
-              </w:tc>
-              <w:tc>
-                <w:tcPr>
-                  <w:tcW w:w="1242" w:type="dxa"/>
-                  <w:shd w:val="clear" w:color="auto" w:fill="2D2170"/>
-                  <w:tcBorders>
-                    <w:top w:val="nil"/>
-                    <w:left w:val="nil"/>
-                    <w:bottom w:val="nil"/>
-                    <w:right w:val="nil"/>
-                  </w:tcBorders>
-                  <w:tcMar>
-                    <w:top w:w="0" w:type="dxa"/>
-                    <w:left w:w="80" w:type="dxa"/>
-                    <w:bottom w:w="0" w:type="dxa"/>
-                    <w:right w:w="80" w:type="dxa"/>
-                  </w:tcMar>
-                </w:tcPr>
-                <w:p>
-                  <w:pPr>
-                    <w:spacing w:before="30" w:after="30"/>
-                  </w:pPr>
-                  <w:r>
-                    <w:rPr>
-                      <w:rFonts w:ascii="Calibri" w:hAnsi="Calibri" w:cs="Calibri"/>
-                      <w:b/>
-                      <w:bCs/>
-                      <w:color w:val="B0BFDF"/>
-                      <w:sz w:val="16"/>
-                      <w:szCs w:val="16"/>
-                    </w:rPr>
-                    <w:t xml:space="preserve">Επίπεδο</w:t>
-                  </w:r>
-                </w:p>
-              </w:tc>
-            </w:tr>
-            <w:tr>
-              <w:tc>
-                <w:tcPr>
-                  <w:tcW w:w="1518" w:type="dxa"/>
-                  <w:shd w:val="clear" w:color="auto" w:fill="2D2170"/>
-                  <w:tcBorders>
-                    <w:top w:val="nil"/>
-                    <w:left w:val="nil"/>
-                    <w:bottom w:val="nil"/>
-                    <w:right w:val="nil"/>
-                  </w:tcBorders>
-                  <w:tcMar>
-                    <w:top w:w="0" w:type="dxa"/>
-                    <w:left w:w="160" w:type="dxa"/>
-                    <w:bottom w:w="0" w:type="dxa"/>
-                    <w:right w:w="80" w:type="dxa"/>
-                  </w:tcMar>
-                </w:tcPr>
-                <w:p>
-                  <w:pPr>
-                    <w:spacing w:before="40" w:after="40"/>
-                  </w:pPr>
-                  <w:r>
-                    <w:rPr>
-                      <w:rFonts w:ascii="Calibri" w:hAnsi="Calibri" w:cs="Calibri"/>
-                      <w:color w:val="FFFFFF"/>
-                      <w:sz w:val="16"/>
-                      <w:szCs w:val="16"/>
-                    </w:rPr>
-                    <w:t xml:space="preserve">{#languageRows}{language}</w:t>
-                  </w:r>
-                </w:p>
-              </w:tc>
-              <w:tc>
-                <w:tcPr>
-                  <w:tcW w:w="1242" w:type="dxa"/>
-                  <w:shd w:val="clear" w:color="auto" w:fill="2D2170"/>
-                  <w:tcBorders>
-                    <w:top w:val="nil"/>
-                    <w:left w:val="nil"/>
-                    <w:bottom w:val="nil"/>
-                    <w:right w:val="nil"/>
-                  </w:tcBorders>
-                  <w:tcMar>
-                    <w:top w:w="0" w:type="dxa"/>
-                    <w:left w:w="80" w:type="dxa"/>
-                    <w:bottom w:w="0" w:type="dxa"/>
-                    <w:right w:w="80" w:type="dxa"/>
-                  </w:tcMar>
-                </w:tcPr>
-                <w:p>
-                  <w:pPr>
-                    <w:spacing w:before="40" w:after="40"/>
-                  </w:pPr>
-                  <w:r>
-                    <w:rPr>
-                      <w:rFonts w:ascii="Calibri" w:hAnsi="Calibri" w:cs="Calibri"/>
-                      <w:color w:val="FFFFFF"/>
+                      <w:i/>
+                      <w:iCs/>
+                      <w:color w:val="A0AEC0"/>
                       <w:sz w:val="16"/>
                       <w:szCs w:val="16"/>
                     </w:rPr>
@@ -603,18 +491,17 @@
             </w:pPr>
             <w:r>
               <w:rPr>
-                <w:rFonts w:ascii="Calibri" w:hAnsi="Calibri" w:cs="Calibri"/>
                 <w:color w:val="FFFFFF"/>
                 <w:sz w:val="2"/>
                 <w:szCs w:val="2"/>
               </w:rPr>
-              <w:t xml:space="preserve">{/hasLanguages}</w:t>
+              <w:t>{/hasLanguages}</w:t>
             </w:r>
           </w:p>
         </w:tc>
         <w:tc>
           <w:tcPr>
-            <w:tcW w:w="6878" w:type="dxa"/>
+            <w:tcW w:w="6738" w:type="dxa"/>
             <w:tcBorders>
               <w:top w:val="nil"/>
               <w:left w:val="nil"/>
@@ -623,687 +510,58 @@
             </w:tcBorders>
             <w:vAlign w:val="top"/>
             <w:tcMar>
-              <w:top w:w="0" w:type="dxa"/>
-              <w:left w:w="160" w:type="dxa"/>
-              <w:bottom w:w="0" w:type="dxa"/>
-              <w:right w:w="108" w:type="dxa"/>
+              <w:top w:w="160" w:type="dxa"/>
+              <w:left w:w="200" w:type="dxa"/>
+              <w:bottom w:w="160" w:type="dxa"/>
+              <w:right w:w="0" w:type="dxa"/>
             </w:tcMar>
           </w:tcPr>
+          <w:p>
+            <w:pPr>
+              <w:pBdr>
+                <w:bottom w:val="single" w:sz="6" w:space="1" w:color="2D2170"/>
+              </w:pBdr>
+              <w:spacing w:before="100" w:after="80"/>
+            </w:pPr>
+            <w:r>
+              <w:rPr>
+                <w:rFonts w:ascii="Calibri" w:hAnsi="Calibri" w:cs="Calibri"/>
+                <w:b/>
+                <w:bCs/>
+                <w:color w:val="2D2170"/>
+                <w:sz w:val="24"/>
+                <w:szCs w:val="24"/>
+                <w:lang w:val="el-GR"/>
+              </w:rPr>
+              <w:t xml:space="preserve">ΕΚΠΑΙΔΕΥΣΗ</w:t>
+            </w:r>
+          </w:p>
           <w:tbl>
             <w:tblPr>
-              <w:tblW w:w="6878" w:type="dxa"/>
+              <w:tblW w:w="6738" w:type="dxa"/>
               <w:tblBorders>
-                <w:top w:val="single" w:sz="4" w:color="C8D0DC"/>
-                <w:left w:val="single" w:sz="4" w:color="C8D0DC"/>
-                <w:bottom w:val="single" w:sz="4" w:color="C8D0DC"/>
-                <w:right w:val="single" w:sz="4" w:color="C8D0DC"/>
-                <w:insideH w:val="single" w:sz="4" w:color="C8D0DC"/>
-                <w:insideV w:val="single" w:sz="4" w:color="C8D0DC"/>
+                <w:top w:val="nil"/>
+                <w:left w:val="nil"/>
+                <w:bottom w:val="nil"/>
+                <w:right w:val="nil"/>
+                <w:insideH w:val="nil"/>
+                <w:insideV w:val="nil"/>
               </w:tblBorders>
               <w:tblLook w:val="04A0"/>
             </w:tblPr>
             <w:tblGrid>
-              <w:gridCol w:w="2751"/>
-              <w:gridCol w:w="2407"/>
-              <w:gridCol w:w="1720"/>
+              <w:gridCol w:w="2560"/>
+              <w:gridCol w:w="2358"/>
+              <w:gridCol w:w="1820"/>
             </w:tblGrid>
             <w:tr>
-              <w:trPr>
-                <w:trHeight w:val="440" w:hRule="atLeast"/>
-              </w:trPr>
               <w:tc>
                 <w:tcPr>
-                  <w:tcW w:w="6878" w:type="dxa"/>
-                  <w:gridSpan w:val="3"/>
-                  <w:shd w:val="clear" w:color="auto" w:fill="2D2170"/>
+                  <w:tcW w:w="2560" w:type="dxa"/>
                   <w:tcBorders>
                     <w:top w:val="nil"/>
                     <w:left w:val="nil"/>
-                    <w:bottom w:val="nil"/>
-                    <w:right w:val="nil"/>
-                  </w:tcBorders>
-                  <w:vAlign w:val="center"/>
-                  <w:tcMar>
-                    <w:top w:w="60" w:type="dxa"/>
-                    <w:left w:w="160" w:type="dxa"/>
-                    <w:bottom w:w="60" w:type="dxa"/>
-                    <w:right w:w="160" w:type="dxa"/>
-                  </w:tcMar>
-                </w:tcPr>
-                <w:p>
-                  <w:pPr>
-                    <w:spacing w:before="80" w:after="80"/>
-                  </w:pPr>
-                  <w:r>
-                    <w:rPr>
-                      <w:rFonts w:ascii="Calibri" w:hAnsi="Calibri" w:cs="Calibri"/>
-                      <w:b/>
-                      <w:bCs/>
-                      <w:color w:val="FFFFFF"/>
-                      <w:sz w:val="20"/>
-                      <w:szCs w:val="20"/>
-                      <w:lang w:val="el-GR"/>
-                    </w:rPr>
-                    <w:t xml:space="preserve">ΕΚΠΑΙΔΕΥΣΗ</w:t>
-                  </w:r>
-                </w:p>
-              </w:tc>
-            </w:tr>
-            <w:tr>
-              <w:tc>
-                <w:tcPr>
-                  <w:tcW w:w="2751" w:type="dxa"/>
-                  <w:shd w:val="clear" w:color="auto" w:fill="D5D2F0"/>
-                  <w:tcBorders>
-                    <w:top w:val="nil"/>
-                    <w:left w:val="nil"/>
-                    <w:bottom w:val="nil"/>
-                    <w:right w:val="nil"/>
-                  </w:tcBorders>
-                  <w:tcMar>
-                    <w:top w:w="60" w:type="dxa"/>
-                    <w:left w:w="108" w:type="dxa"/>
-                    <w:bottom w:w="60" w:type="dxa"/>
-                    <w:right w:w="108" w:type="dxa"/>
-                  </w:tcMar>
-                </w:tcPr>
-                <w:p>
-                  <w:pPr>
-                    <w:spacing w:before="50" w:after="50"/>
-                  </w:pPr>
-                  <w:r>
-                    <w:rPr>
-                      <w:rFonts w:ascii="Calibri" w:hAnsi="Calibri" w:cs="Calibri"/>
-                      <w:b/>
-                      <w:bCs/>
-                      <w:sz w:val="16"/>
-                      <w:szCs w:val="16"/>
-                      <w:lang w:val="el-GR"/>
-                    </w:rPr>
-                    <w:t xml:space="preserve">Ίδρυμα / Σχολή</w:t>
-                  </w:r>
-                </w:p>
-              </w:tc>
-              <w:tc>
-                <w:tcPr>
-                  <w:tcW w:w="2407" w:type="dxa"/>
-                  <w:shd w:val="clear" w:color="auto" w:fill="D5D2F0"/>
-                  <w:tcBorders>
-                    <w:top w:val="nil"/>
-                    <w:left w:val="nil"/>
-                    <w:bottom w:val="nil"/>
-                    <w:right w:val="nil"/>
-                  </w:tcBorders>
-                  <w:tcMar>
-                    <w:top w:w="60" w:type="dxa"/>
-                    <w:left w:w="108" w:type="dxa"/>
-                    <w:bottom w:w="60" w:type="dxa"/>
-                    <w:right w:w="108" w:type="dxa"/>
-                  </w:tcMar>
-                </w:tcPr>
-                <w:p>
-                  <w:pPr>
-                    <w:spacing w:before="50" w:after="50"/>
-                  </w:pPr>
-                  <w:r>
-                    <w:rPr>
-                      <w:rFonts w:ascii="Calibri" w:hAnsi="Calibri" w:cs="Calibri"/>
-                      <w:b/>
-                      <w:bCs/>
-                      <w:sz w:val="16"/>
-                      <w:szCs w:val="16"/>
-                      <w:lang w:val="el-GR"/>
-                    </w:rPr>
-                    <w:t xml:space="preserve">Τίτλος Πτυχίου</w:t>
-                  </w:r>
-                </w:p>
-              </w:tc>
-              <w:tc>
-                <w:tcPr>
-                  <w:tcW w:w="1720" w:type="dxa"/>
-                  <w:shd w:val="clear" w:color="auto" w:fill="D5D2F0"/>
-                  <w:tcBorders>
-                    <w:top w:val="nil"/>
-                    <w:left w:val="nil"/>
-                    <w:bottom w:val="nil"/>
-                    <w:right w:val="nil"/>
-                  </w:tcBorders>
-                  <w:tcMar>
-                    <w:top w:w="60" w:type="dxa"/>
-                    <w:left w:w="108" w:type="dxa"/>
-                    <w:bottom w:w="60" w:type="dxa"/>
-                    <w:right w:w="108" w:type="dxa"/>
-                  </w:tcMar>
-                </w:tcPr>
-                <w:p>
-                  <w:pPr>
-                    <w:spacing w:before="50" w:after="50"/>
-                  </w:pPr>
-                  <w:r>
-                    <w:rPr>
-                      <w:rFonts w:ascii="Calibri" w:hAnsi="Calibri" w:cs="Calibri"/>
-                      <w:b/>
-                      <w:bCs/>
-                      <w:sz w:val="16"/>
-                      <w:szCs w:val="16"/>
-                      <w:lang w:val="el-GR"/>
-                    </w:rPr>
-                    <w:t xml:space="preserve">Ειδικότητα</w:t>
-                  </w:r>
-                </w:p>
-              </w:tc>
-            </w:tr>
-            <w:tr>
-              <w:tc>
-                <w:tcPr>
-                  <w:tcW w:w="2751" w:type="dxa"/>
-                  <w:tcBorders>
-                    <w:top w:val="nil"/>
-                    <w:left w:val="nil"/>
-                    <w:bottom w:val="nil"/>
-                    <w:right w:val="nil"/>
-                  </w:tcBorders>
-                  <w:tcMar>
-                    <w:top w:w="60" w:type="dxa"/>
-                    <w:left w:w="108" w:type="dxa"/>
-                    <w:bottom w:w="60" w:type="dxa"/>
-                    <w:right w:w="108" w:type="dxa"/>
-                  </w:tcMar>
-                </w:tcPr>
-                <w:p>
-                  <w:pPr>
-                    <w:spacing w:before="50" w:after="50"/>
-                  </w:pPr>
-                  <w:r>
-                    <w:rPr>
-                      <w:rFonts w:ascii="Calibri" w:hAnsi="Calibri" w:cs="Calibri"/>
-                      <w:sz w:val="16"/>
-                      <w:szCs w:val="16"/>
-                      <w:lang w:val="el-GR"/>
-                    </w:rPr>
-                    <w:t xml:space="preserve">{#educationOnlyRows}{institutionFull}</w:t>
-                  </w:r>
-                </w:p>
-              </w:tc>
-              <w:tc>
-                <w:tcPr>
-                  <w:tcW w:w="2407" w:type="dxa"/>
-                  <w:tcBorders>
-                    <w:top w:val="nil"/>
-                    <w:left w:val="nil"/>
-                    <w:bottom w:val="nil"/>
-                    <w:right w:val="nil"/>
-                  </w:tcBorders>
-                  <w:tcMar>
-                    <w:top w:w="60" w:type="dxa"/>
-                    <w:left w:w="108" w:type="dxa"/>
-                    <w:bottom w:w="60" w:type="dxa"/>
-                    <w:right w:w="108" w:type="dxa"/>
-                  </w:tcMar>
-                </w:tcPr>
-                <w:p>
-                  <w:pPr>
-                    <w:spacing w:before="50" w:after="50"/>
-                  </w:pPr>
-                  <w:r>
-                    <w:rPr>
-                      <w:rFonts w:ascii="Calibri" w:hAnsi="Calibri" w:cs="Calibri"/>
-                      <w:sz w:val="16"/>
-                      <w:szCs w:val="16"/>
-                      <w:lang w:val="el-GR"/>
-                    </w:rPr>
-                    <w:t xml:space="preserve">{degreeTitle}</w:t>
-                  </w:r>
-                </w:p>
-              </w:tc>
-              <w:tc>
-                <w:tcPr>
-                  <w:tcW w:w="1720" w:type="dxa"/>
-                  <w:tcBorders>
-                    <w:top w:val="nil"/>
-                    <w:left w:val="nil"/>
-                    <w:bottom w:val="nil"/>
-                    <w:right w:val="nil"/>
-                  </w:tcBorders>
-                  <w:tcMar>
-                    <w:top w:w="60" w:type="dxa"/>
-                    <w:left w:w="108" w:type="dxa"/>
-                    <w:bottom w:w="60" w:type="dxa"/>
-                    <w:right w:w="108" w:type="dxa"/>
-                  </w:tcMar>
-                </w:tcPr>
-                <w:p>
-                  <w:pPr>
-                    <w:spacing w:before="50" w:after="50"/>
-                  </w:pPr>
-                  <w:r>
-                    <w:rPr>
-                      <w:rFonts w:ascii="Calibri" w:hAnsi="Calibri" w:cs="Calibri"/>
-                      <w:sz w:val="16"/>
-                      <w:szCs w:val="16"/>
-                      <w:lang w:val="el-GR"/>
-                    </w:rPr>
-                    <w:t xml:space="preserve">{specialization} {dateAwarded}{/educationOnlyRows}</w:t>
-                  </w:r>
-                </w:p>
-              </w:tc>
-            </w:tr>
-          </w:tbl>
-          <w:p>
-            <w:pPr>
-              <w:spacing w:before="80" w:after="0"/>
-            </w:pPr>
-          </w:p>
-          <w:tbl>
-            <w:tblPr>
-              <w:tblW w:w="6878" w:type="dxa"/>
-              <w:tblBorders>
-                <w:top w:val="single" w:sz="4" w:color="C8D0DC"/>
-                <w:left w:val="single" w:sz="4" w:color="C8D0DC"/>
-                <w:bottom w:val="single" w:sz="4" w:color="C8D0DC"/>
-                <w:right w:val="single" w:sz="4" w:color="C8D0DC"/>
-                <w:insideH w:val="single" w:sz="4" w:color="C8D0DC"/>
-                <w:insideV w:val="single" w:sz="4" w:color="C8D0DC"/>
-              </w:tblBorders>
-              <w:tblLook w:val="04A0"/>
-            </w:tblPr>
-            <w:tblGrid>
-              <w:gridCol w:w="2407"/>
-              <w:gridCol w:w="1926"/>
-              <w:gridCol w:w="1376"/>
-              <w:gridCol w:w="1169"/>
-            </w:tblGrid>
-            <w:tr>
-              <w:trPr>
-                <w:trHeight w:val="440" w:hRule="atLeast"/>
-              </w:trPr>
-              <w:tc>
-                <w:tcPr>
-                  <w:tcW w:w="6878" w:type="dxa"/>
-                  <w:gridSpan w:val="4"/>
-                  <w:shd w:val="clear" w:color="auto" w:fill="2D2170"/>
-                  <w:tcBorders>
-                    <w:top w:val="nil"/>
-                    <w:left w:val="nil"/>
-                    <w:bottom w:val="nil"/>
-                    <w:right w:val="nil"/>
-                  </w:tcBorders>
-                  <w:vAlign w:val="center"/>
-                  <w:tcMar>
-                    <w:top w:w="60" w:type="dxa"/>
-                    <w:left w:w="160" w:type="dxa"/>
-                    <w:bottom w:w="60" w:type="dxa"/>
-                    <w:right w:w="160" w:type="dxa"/>
-                  </w:tcMar>
-                </w:tcPr>
-                <w:p>
-                  <w:pPr>
-                    <w:spacing w:before="80" w:after="80"/>
-                  </w:pPr>
-                  <w:r>
-                    <w:rPr>
-                      <w:rFonts w:ascii="Calibri" w:hAnsi="Calibri" w:cs="Calibri"/>
-                      <w:b/>
-                      <w:bCs/>
-                      <w:color w:val="FFFFFF"/>
-                      <w:sz w:val="20"/>
-                      <w:szCs w:val="20"/>
-                      <w:lang w:val="el-GR"/>
-                    </w:rPr>
-                    <w:t xml:space="preserve">ΕΠΑΓΓΕΛΜΑΤΙΚΗ ΕΜΠΕΙΡΙΑ</w:t>
-                  </w:r>
-                </w:p>
-              </w:tc>
-            </w:tr>
-            <w:tr>
-              <w:tc>
-                <w:tcPr>
-                  <w:tcW w:w="2407" w:type="dxa"/>
-                  <w:shd w:val="clear" w:color="auto" w:fill="D5D2F0"/>
-                  <w:tcBorders>
-                    <w:top w:val="nil"/>
-                    <w:left w:val="nil"/>
-                    <w:bottom w:val="nil"/>
-                    <w:right w:val="nil"/>
-                  </w:tcBorders>
-                  <w:tcMar>
-                    <w:top w:w="60" w:type="dxa"/>
-                    <w:left w:w="108" w:type="dxa"/>
-                    <w:bottom w:w="60" w:type="dxa"/>
-                    <w:right w:w="108" w:type="dxa"/>
-                  </w:tcMar>
-                </w:tcPr>
-                <w:p>
-                  <w:pPr>
-                    <w:spacing w:before="50" w:after="50"/>
-                  </w:pPr>
-                  <w:r>
-                    <w:rPr>
-                      <w:rFonts w:ascii="Calibri" w:hAnsi="Calibri" w:cs="Calibri"/>
-                      <w:b/>
-                      <w:bCs/>
-                      <w:sz w:val="16"/>
-                      <w:szCs w:val="16"/>
-                      <w:lang w:val="el-GR"/>
-                    </w:rPr>
-                    <w:t xml:space="preserve">Έργο / Θέση</w:t>
-                  </w:r>
-                </w:p>
-              </w:tc>
-              <w:tc>
-                <w:tcPr>
-                  <w:tcW w:w="1926" w:type="dxa"/>
-                  <w:shd w:val="clear" w:color="auto" w:fill="D5D2F0"/>
-                  <w:tcBorders>
-                    <w:top w:val="nil"/>
-                    <w:left w:val="nil"/>
-                    <w:bottom w:val="nil"/>
-                    <w:right w:val="nil"/>
-                  </w:tcBorders>
-                  <w:tcMar>
-                    <w:top w:w="60" w:type="dxa"/>
-                    <w:left w:w="108" w:type="dxa"/>
-                    <w:bottom w:w="60" w:type="dxa"/>
-                    <w:right w:w="108" w:type="dxa"/>
-                  </w:tcMar>
-                </w:tcPr>
-                <w:p>
-                  <w:pPr>
-                    <w:spacing w:before="50" w:after="50"/>
-                  </w:pPr>
-                  <w:r>
-                    <w:rPr>
-                      <w:rFonts w:ascii="Calibri" w:hAnsi="Calibri" w:cs="Calibri"/>
-                      <w:b/>
-                      <w:bCs/>
-                      <w:sz w:val="16"/>
-                      <w:szCs w:val="16"/>
-                      <w:lang w:val="el-GR"/>
-                    </w:rPr>
-                    <w:t xml:space="preserve">Εργοδότης</w:t>
-                  </w:r>
-                </w:p>
-              </w:tc>
-              <w:tc>
-                <w:tcPr>
-                  <w:tcW w:w="1376" w:type="dxa"/>
-                  <w:shd w:val="clear" w:color="auto" w:fill="D5D2F0"/>
-                  <w:tcBorders>
-                    <w:top w:val="nil"/>
-                    <w:left w:val="nil"/>
-                    <w:bottom w:val="nil"/>
-                    <w:right w:val="nil"/>
-                  </w:tcBorders>
-                  <w:tcMar>
-                    <w:top w:w="60" w:type="dxa"/>
-                    <w:left w:w="108" w:type="dxa"/>
-                    <w:bottom w:w="60" w:type="dxa"/>
-                    <w:right w:w="108" w:type="dxa"/>
-                  </w:tcMar>
-                </w:tcPr>
-                <w:p>
-                  <w:pPr>
-                    <w:spacing w:before="50" w:after="50"/>
-                  </w:pPr>
-                  <w:r>
-                    <w:rPr>
-                      <w:rFonts w:ascii="Calibri" w:hAnsi="Calibri" w:cs="Calibri"/>
-                      <w:b/>
-                      <w:bCs/>
-                      <w:sz w:val="16"/>
-                      <w:szCs w:val="16"/>
-                      <w:lang w:val="el-GR"/>
-                    </w:rPr>
-                    <w:t xml:space="preserve">Ρόλος</w:t>
-                  </w:r>
-                </w:p>
-              </w:tc>
-              <w:tc>
-                <w:tcPr>
-                  <w:tcW w:w="1169" w:type="dxa"/>
-                  <w:shd w:val="clear" w:color="auto" w:fill="D5D2F0"/>
-                  <w:tcBorders>
-                    <w:top w:val="nil"/>
-                    <w:left w:val="nil"/>
-                    <w:bottom w:val="nil"/>
-                    <w:right w:val="nil"/>
-                  </w:tcBorders>
-                  <w:tcMar>
-                    <w:top w:w="60" w:type="dxa"/>
-                    <w:left w:w="108" w:type="dxa"/>
-                    <w:bottom w:w="60" w:type="dxa"/>
-                    <w:right w:w="108" w:type="dxa"/>
-                  </w:tcMar>
-                </w:tcPr>
-                <w:p>
-                  <w:pPr>
-                    <w:spacing w:before="50" w:after="50"/>
-                  </w:pPr>
-                  <w:r>
-                    <w:rPr>
-                      <w:rFonts w:ascii="Calibri" w:hAnsi="Calibri" w:cs="Calibri"/>
-                      <w:b/>
-                      <w:bCs/>
-                      <w:sz w:val="16"/>
-                      <w:szCs w:val="16"/>
-                      <w:lang w:val="el-GR"/>
-                    </w:rPr>
-                    <w:t xml:space="preserve">Περίοδος</w:t>
-                  </w:r>
-                </w:p>
-              </w:tc>
-            </w:tr>
-            <w:tr>
-              <w:tc>
-                <w:tcPr>
-                  <w:tcW w:w="2407" w:type="dxa"/>
-                  <w:tcBorders>
-                    <w:top w:val="nil"/>
-                    <w:left w:val="nil"/>
-                    <w:bottom w:val="nil"/>
-                    <w:right w:val="nil"/>
-                  </w:tcBorders>
-                  <w:tcMar>
-                    <w:top w:w="60" w:type="dxa"/>
-                    <w:left w:w="108" w:type="dxa"/>
-                    <w:bottom w:w="60" w:type="dxa"/>
-                    <w:right w:w="108" w:type="dxa"/>
-                  </w:tcMar>
-                </w:tcPr>
-                <w:p>
-                  <w:pPr>
-                    <w:spacing w:before="50" w:after="50"/>
-                  </w:pPr>
-                  <w:r>
-                    <w:rPr>
-                      <w:rFonts w:ascii="Calibri" w:hAnsi="Calibri" w:cs="Calibri"/>
-                      <w:sz w:val="16"/>
-                      <w:szCs w:val="16"/>
-                      <w:lang w:val="el-GR"/>
-                    </w:rPr>
-                    <w:t xml:space="preserve">{#experienceRows}{projectText}</w:t>
-                  </w:r>
-                </w:p>
-              </w:tc>
-              <w:tc>
-                <w:tcPr>
-                  <w:tcW w:w="1926" w:type="dxa"/>
-                  <w:tcBorders>
-                    <w:top w:val="nil"/>
-                    <w:left w:val="nil"/>
-                    <w:bottom w:val="nil"/>
-                    <w:right w:val="nil"/>
-                  </w:tcBorders>
-                  <w:tcMar>
-                    <w:top w:w="60" w:type="dxa"/>
-                    <w:left w:w="108" w:type="dxa"/>
-                    <w:bottom w:w="60" w:type="dxa"/>
-                    <w:right w:w="108" w:type="dxa"/>
-                  </w:tcMar>
-                </w:tcPr>
-                <w:p>
-                  <w:pPr>
-                    <w:spacing w:before="50" w:after="50"/>
-                  </w:pPr>
-                  <w:r>
-                    <w:rPr>
-                      <w:rFonts w:ascii="Calibri" w:hAnsi="Calibri" w:cs="Calibri"/>
-                      <w:sz w:val="16"/>
-                      <w:szCs w:val="16"/>
-                      <w:lang w:val="el-GR"/>
-                    </w:rPr>
-                    <w:t xml:space="preserve">{employerName}</w:t>
-                  </w:r>
-                </w:p>
-              </w:tc>
-              <w:tc>
-                <w:tcPr>
-                  <w:tcW w:w="1376" w:type="dxa"/>
-                  <w:tcBorders>
-                    <w:top w:val="nil"/>
-                    <w:left w:val="nil"/>
-                    <w:bottom w:val="nil"/>
-                    <w:right w:val="nil"/>
-                  </w:tcBorders>
-                  <w:tcMar>
-                    <w:top w:w="60" w:type="dxa"/>
-                    <w:left w:w="108" w:type="dxa"/>
-                    <w:bottom w:w="60" w:type="dxa"/>
-                    <w:right w:w="108" w:type="dxa"/>
-                  </w:tcMar>
-                </w:tcPr>
-                <w:p>
-                  <w:pPr>
-                    <w:spacing w:before="50" w:after="50"/>
-                  </w:pPr>
-                  <w:r>
-                    <w:rPr>
-                      <w:rFonts w:ascii="Calibri" w:hAnsi="Calibri" w:cs="Calibri"/>
-                      <w:sz w:val="16"/>
-                      <w:szCs w:val="16"/>
-                      <w:lang w:val="el-GR"/>
-                    </w:rPr>
-                    <w:t xml:space="preserve">{roleName}</w:t>
-                  </w:r>
-                </w:p>
-              </w:tc>
-              <w:tc>
-                <w:tcPr>
-                  <w:tcW w:w="1169" w:type="dxa"/>
-                  <w:tcBorders>
-                    <w:top w:val="nil"/>
-                    <w:left w:val="nil"/>
-                    <w:bottom w:val="nil"/>
-                    <w:right w:val="nil"/>
-                  </w:tcBorders>
-                  <w:tcMar>
-                    <w:top w:w="60" w:type="dxa"/>
-                    <w:left w:w="108" w:type="dxa"/>
-                    <w:bottom w:w="60" w:type="dxa"/>
-                    <w:right w:w="108" w:type="dxa"/>
-                  </w:tcMar>
-                </w:tcPr>
-                <w:p>
-                  <w:pPr>
-                    <w:spacing w:before="50" w:after="50"/>
-                  </w:pPr>
-                  <w:r>
-                    <w:rPr>
-                      <w:rFonts w:ascii="Calibri" w:hAnsi="Calibri" w:cs="Calibri"/>
-                      <w:sz w:val="16"/>
-                      <w:szCs w:val="16"/>
-                      <w:lang w:val="el-GR"/>
-                    </w:rPr>
-                    <w:t xml:space="preserve">{period}{/experienceRows}</w:t>
-                  </w:r>
-                </w:p>
-              </w:tc>
-            </w:tr>
-          </w:tbl>
-          <w:p>
-            <w:pPr>
-              <w:spacing w:before="80" w:after="0"/>
-            </w:pPr>
-          </w:p>
-          <w:p>
-            <w:pPr>
-              <w:spacing w:before="0" w:after="0"/>
-            </w:pPr>
-            <w:r>
-              <w:rPr>
-                <w:rFonts w:ascii="Calibri" w:hAnsi="Calibri" w:cs="Calibri"/>
-                <w:color w:val="FFFFFF"/>
-                <w:sz w:val="2"/>
-                <w:szCs w:val="2"/>
-              </w:rPr>
-              <w:t xml:space="preserve">{#hasPublications}</w:t>
-            </w:r>
-          </w:p>
-          <w:tbl>
-            <w:tblPr>
-              <w:tblW w:w="6878" w:type="dxa"/>
-              <w:tblBorders>
-                <w:top w:val="single" w:sz="4" w:color="C8D0DC"/>
-                <w:left w:val="single" w:sz="4" w:color="C8D0DC"/>
-                <w:bottom w:val="single" w:sz="4" w:color="C8D0DC"/>
-                <w:right w:val="single" w:sz="4" w:color="C8D0DC"/>
-                <w:insideH w:val="single" w:sz="4" w:color="C8D0DC"/>
-                <w:insideV w:val="single" w:sz="4" w:color="C8D0DC"/>
-              </w:tblBorders>
-              <w:tblLook w:val="04A0"/>
-            </w:tblPr>
-            <w:tblGrid>
-              <w:gridCol w:w="6878"/>
-            </w:tblGrid>
-            <w:tr>
-              <w:trPr>
-                <w:trHeight w:val="440" w:hRule="atLeast"/>
-              </w:trPr>
-              <w:tc>
-                <w:tcPr>
-                  <w:tcW w:w="6878" w:type="dxa"/>
-                  <w:shd w:val="clear" w:color="auto" w:fill="2D2170"/>
-                  <w:tcBorders>
-                    <w:top w:val="nil"/>
-                    <w:left w:val="nil"/>
-                    <w:bottom w:val="nil"/>
-                    <w:right w:val="nil"/>
-                  </w:tcBorders>
-                  <w:vAlign w:val="center"/>
-                  <w:tcMar>
-                    <w:top w:w="60" w:type="dxa"/>
-                    <w:left w:w="160" w:type="dxa"/>
-                    <w:bottom w:w="60" w:type="dxa"/>
-                    <w:right w:w="160" w:type="dxa"/>
-                  </w:tcMar>
-                </w:tcPr>
-                <w:p>
-                  <w:pPr>
-                    <w:spacing w:before="80" w:after="80"/>
-                  </w:pPr>
-                  <w:r>
-                    <w:rPr>
-                      <w:rFonts w:ascii="Calibri" w:hAnsi="Calibri" w:cs="Calibri"/>
-                      <w:b/>
-                      <w:bCs/>
-                      <w:color w:val="FFFFFF"/>
-                      <w:sz w:val="20"/>
-                      <w:szCs w:val="20"/>
-                      <w:lang w:val="el-GR"/>
-                    </w:rPr>
-                    <w:t xml:space="preserve">ΔΗΜΟΣΙΕΥΣΕΙΣ</w:t>
-                  </w:r>
-                </w:p>
-              </w:tc>
-            </w:tr>
-            <w:tr>
-              <w:tc>
-                <w:tcPr>
-                  <w:tcW w:w="6878" w:type="dxa"/>
-                  <w:tcBorders>
-                    <w:top w:val="nil"/>
-                    <w:left w:val="nil"/>
-                    <w:bottom w:val="nil"/>
+                    <w:bottom w:val="single" w:sz="8" w:space="0" w:color="2D2170"/>
                     <w:right w:val="nil"/>
                   </w:tcBorders>
                   <w:tcMar>
@@ -1320,8 +578,261 @@
                   <w:r>
                     <w:rPr>
                       <w:rFonts w:ascii="Calibri" w:hAnsi="Calibri" w:cs="Calibri"/>
+                      <w:b/>
+                      <w:bCs/>
+                      <w:color w:val="2D2170"/>
                       <w:sz w:val="18"/>
                       <w:szCs w:val="18"/>
+                      <w:lang w:val="el-GR"/>
+                    </w:rPr>
+                    <w:t xml:space="preserve">Ίδρυμα / Σχολή</w:t>
+                  </w:r>
+                </w:p>
+              </w:tc>
+              <w:tc>
+                <w:tcPr>
+                  <w:tcW w:w="2358" w:type="dxa"/>
+                  <w:tcBorders>
+                    <w:top w:val="nil"/>
+                    <w:left w:val="nil"/>
+                    <w:bottom w:val="single" w:sz="8" w:space="0" w:color="2D2170"/>
+                    <w:right w:val="nil"/>
+                  </w:tcBorders>
+                  <w:tcMar>
+                    <w:top w:w="60" w:type="dxa"/>
+                    <w:left w:w="108" w:type="dxa"/>
+                    <w:bottom w:w="60" w:type="dxa"/>
+                    <w:right w:w="108" w:type="dxa"/>
+                  </w:tcMar>
+                </w:tcPr>
+                <w:p>
+                  <w:pPr>
+                    <w:spacing w:before="60" w:after="60"/>
+                  </w:pPr>
+                  <w:r>
+                    <w:rPr>
+                      <w:rFonts w:ascii="Calibri" w:hAnsi="Calibri" w:cs="Calibri"/>
+                      <w:b/>
+                      <w:bCs/>
+                      <w:color w:val="2D2170"/>
+                      <w:sz w:val="18"/>
+                      <w:szCs w:val="18"/>
+                      <w:lang w:val="el-GR"/>
+                    </w:rPr>
+                    <w:t xml:space="preserve">Τίτλος Πτυχίου</w:t>
+                  </w:r>
+                </w:p>
+              </w:tc>
+              <w:tc>
+                <w:tcPr>
+                  <w:tcW w:w="1820" w:type="dxa"/>
+                  <w:tcBorders>
+                    <w:top w:val="nil"/>
+                    <w:left w:val="nil"/>
+                    <w:bottom w:val="single" w:sz="8" w:space="0" w:color="2D2170"/>
+                    <w:right w:val="nil"/>
+                  </w:tcBorders>
+                  <w:tcMar>
+                    <w:top w:w="60" w:type="dxa"/>
+                    <w:left w:w="108" w:type="dxa"/>
+                    <w:bottom w:w="60" w:type="dxa"/>
+                    <w:right w:w="108" w:type="dxa"/>
+                  </w:tcMar>
+                </w:tcPr>
+                <w:p>
+                  <w:pPr>
+                    <w:spacing w:before="60" w:after="60"/>
+                  </w:pPr>
+                  <w:r>
+                    <w:rPr>
+                      <w:rFonts w:ascii="Calibri" w:hAnsi="Calibri" w:cs="Calibri"/>
+                      <w:b/>
+                      <w:bCs/>
+                      <w:color w:val="2D2170"/>
+                      <w:sz w:val="18"/>
+                      <w:szCs w:val="18"/>
+                      <w:lang w:val="el-GR"/>
+                    </w:rPr>
+                    <w:t xml:space="preserve">Ειδικότητα &amp; Ημ/νία</w:t>
+                  </w:r>
+                </w:p>
+              </w:tc>
+            </w:tr>
+            <w:tr>
+              <w:tc>
+                <w:tcPr>
+                  <w:tcW w:w="2560" w:type="dxa"/>
+                  <w:tcBorders>
+                    <w:top w:val="nil"/>
+                    <w:left w:val="nil"/>
+                    <w:bottom w:val="single" w:sz="4" w:space="0" w:color="E8ECF0"/>
+                    <w:right w:val="nil"/>
+                  </w:tcBorders>
+                  <w:tcMar>
+                    <w:top w:w="60" w:type="dxa"/>
+                    <w:left w:w="108" w:type="dxa"/>
+                    <w:bottom w:w="60" w:type="dxa"/>
+                    <w:right w:w="108" w:type="dxa"/>
+                  </w:tcMar>
+                </w:tcPr>
+                <w:p>
+                  <w:pPr>
+                    <w:spacing w:before="70" w:after="70"/>
+                  </w:pPr>
+                  <w:r>
+                    <w:rPr>
+                      <w:rFonts w:ascii="Calibri" w:hAnsi="Calibri" w:cs="Calibri"/>
+                      <w:color w:val="2D3748"/>
+                      <w:sz w:val="20"/>
+                      <w:szCs w:val="20"/>
+                      <w:lang w:val="el-GR"/>
+                    </w:rPr>
+                    <w:t xml:space="preserve">{#educationOnlyRows}{institutionFull}</w:t>
+                  </w:r>
+                </w:p>
+              </w:tc>
+              <w:tc>
+                <w:tcPr>
+                  <w:tcW w:w="2358" w:type="dxa"/>
+                  <w:tcBorders>
+                    <w:top w:val="nil"/>
+                    <w:left w:val="nil"/>
+                    <w:bottom w:val="single" w:sz="4" w:space="0" w:color="E8ECF0"/>
+                    <w:right w:val="nil"/>
+                  </w:tcBorders>
+                  <w:tcMar>
+                    <w:top w:w="60" w:type="dxa"/>
+                    <w:left w:w="108" w:type="dxa"/>
+                    <w:bottom w:w="60" w:type="dxa"/>
+                    <w:right w:w="108" w:type="dxa"/>
+                  </w:tcMar>
+                </w:tcPr>
+                <w:p>
+                  <w:pPr>
+                    <w:spacing w:before="70" w:after="70"/>
+                  </w:pPr>
+                  <w:r>
+                    <w:rPr>
+                      <w:rFonts w:ascii="Calibri" w:hAnsi="Calibri" w:cs="Calibri"/>
+                      <w:color w:val="2D3748"/>
+                      <w:sz w:val="20"/>
+                      <w:szCs w:val="20"/>
+                      <w:lang w:val="el-GR"/>
+                    </w:rPr>
+                    <w:t xml:space="preserve">{degreeTitle}</w:t>
+                  </w:r>
+                </w:p>
+              </w:tc>
+              <w:tc>
+                <w:tcPr>
+                  <w:tcW w:w="1820" w:type="dxa"/>
+                  <w:tcBorders>
+                    <w:top w:val="nil"/>
+                    <w:left w:val="nil"/>
+                    <w:bottom w:val="single" w:sz="4" w:space="0" w:color="E8ECF0"/>
+                    <w:right w:val="nil"/>
+                  </w:tcBorders>
+                  <w:tcMar>
+                    <w:top w:w="60" w:type="dxa"/>
+                    <w:left w:w="108" w:type="dxa"/>
+                    <w:bottom w:w="60" w:type="dxa"/>
+                    <w:right w:w="108" w:type="dxa"/>
+                  </w:tcMar>
+                </w:tcPr>
+                <w:p>
+                  <w:pPr>
+                    <w:spacing w:before="70" w:after="70"/>
+                  </w:pPr>
+                  <w:r>
+                    <w:rPr>
+                      <w:rFonts w:ascii="Calibri" w:hAnsi="Calibri" w:cs="Calibri"/>
+                      <w:color w:val="2D3748"/>
+                      <w:sz w:val="20"/>
+                      <w:szCs w:val="20"/>
+                      <w:lang w:val="el-GR"/>
+                    </w:rPr>
+                    <w:t xml:space="preserve">{specialization} {dateAwarded}{/educationOnlyRows}</w:t>
+                  </w:r>
+                </w:p>
+              </w:tc>
+            </w:tr>
+          </w:tbl>
+          <w:p>
+            <w:pPr>
+              <w:spacing w:before="0" w:after="0"/>
+            </w:pPr>
+            <w:r>
+              <w:rPr>
+                <w:color w:val="FFFFFF"/>
+                <w:sz w:val="2"/>
+                <w:szCs w:val="2"/>
+              </w:rPr>
+              <w:t>{#hasPublications}</w:t>
+            </w:r>
+          </w:p>
+          <w:p>
+            <w:pPr>
+              <w:pBdr>
+                <w:bottom w:val="single" w:sz="6" w:space="1" w:color="2D2170"/>
+              </w:pBdr>
+              <w:spacing w:before="160" w:after="80"/>
+            </w:pPr>
+            <w:r>
+              <w:rPr>
+                <w:rFonts w:ascii="Calibri" w:hAnsi="Calibri" w:cs="Calibri"/>
+                <w:b/>
+                <w:bCs/>
+                <w:color w:val="2D2170"/>
+                <w:sz w:val="24"/>
+                <w:szCs w:val="24"/>
+                <w:lang w:val="el-GR"/>
+              </w:rPr>
+              <w:t xml:space="preserve">ΔΗΜΟΣΙΕΥΣΕΙΣ</w:t>
+            </w:r>
+          </w:p>
+          <w:tbl>
+            <w:tblPr>
+              <w:tblW w:w="6738" w:type="dxa"/>
+              <w:tblBorders>
+                <w:top w:val="nil"/>
+                <w:left w:val="nil"/>
+                <w:bottom w:val="nil"/>
+                <w:right w:val="nil"/>
+                <w:insideH w:val="nil"/>
+                <w:insideV w:val="nil"/>
+              </w:tblBorders>
+              <w:tblLook w:val="04A0"/>
+            </w:tblPr>
+            <w:tblGrid>
+              <w:gridCol w:w="6738"/>
+            </w:tblGrid>
+            <w:tr>
+              <w:tc>
+                <w:tcPr>
+                  <w:tcW w:w="6738" w:type="dxa"/>
+                  <w:tcBorders>
+                    <w:top w:val="nil"/>
+                    <w:left w:val="nil"/>
+                    <w:bottom w:val="single" w:sz="4" w:space="0" w:color="E8ECF0"/>
+                    <w:right w:val="nil"/>
+                  </w:tcBorders>
+                  <w:tcMar>
+                    <w:top w:w="60" w:type="dxa"/>
+                    <w:left w:w="108" w:type="dxa"/>
+                    <w:bottom w:w="60" w:type="dxa"/>
+                    <w:right w:w="108" w:type="dxa"/>
+                  </w:tcMar>
+                </w:tcPr>
+                <w:p>
+                  <w:pPr>
+                    <w:spacing w:before="70" w:after="70"/>
+                  </w:pPr>
+                  <w:r>
+                    <w:rPr>
+                      <w:rFonts w:ascii="Calibri" w:hAnsi="Calibri" w:cs="Calibri"/>
+                      <w:color w:val="2D3748"/>
+                      <w:sz w:val="20"/>
+                      <w:szCs w:val="20"/>
                     </w:rPr>
                     <w:t xml:space="preserve">{#publicationRows}{publicationText}{/publicationRows}</w:t>
                   </w:r>
@@ -1331,21 +842,15 @@
           </w:tbl>
           <w:p>
             <w:pPr>
-              <w:spacing w:before="80" w:after="0"/>
-            </w:pPr>
-          </w:p>
-          <w:p>
-            <w:pPr>
               <w:spacing w:before="0" w:after="0"/>
             </w:pPr>
             <w:r>
               <w:rPr>
-                <w:rFonts w:ascii="Calibri" w:hAnsi="Calibri" w:cs="Calibri"/>
                 <w:color w:val="FFFFFF"/>
                 <w:sz w:val="2"/>
                 <w:szCs w:val="2"/>
               </w:rPr>
-              <w:t xml:space="preserve">{/hasPublications}</w:t>
+              <w:t>{/hasPublications}</w:t>
             </w:r>
           </w:p>
         </w:tc>

</xml_diff>

<commit_message>
Add user-authored indigo CV template with fixed paragraph loop tags
</commit_message>
<xml_diff>
--- a/backend/templates/cv_job_indigo_placeholders.docx
+++ b/backend/templates/cv_job_indigo_placeholders.docx
@@ -440,6 +440,19 @@
                 </w:tcPr>
                 <w:p>
                   <w:pPr>
+                    <w:spacing w:before="0" w:after="0"/>
+                  </w:pPr>
+                  <w:r>
+                    <w:rPr>
+                      <w:color w:val="FFFFFF"/>
+                      <w:sz w:val="2"/>
+                      <w:szCs w:val="2"/>
+                    </w:rPr>
+                    <w:t>{#languageRows}</w:t>
+                  </w:r>
+                </w:p>
+                <w:p>
+                  <w:pPr>
                     <w:spacing w:before="40" w:after="10"/>
                   </w:pPr>
                   <w:r>
@@ -449,7 +462,7 @@
                       <w:sz w:val="18"/>
                       <w:szCs w:val="18"/>
                     </w:rPr>
-                    <w:t xml:space="preserve">{#languageRows}{language}</w:t>
+                    <w:t xml:space="preserve">{language}</w:t>
                   </w:r>
                 </w:p>
                 <w:p>
@@ -479,7 +492,20 @@
                       <w:sz w:val="16"/>
                       <w:szCs w:val="16"/>
                     </w:rPr>
-                    <w:t xml:space="preserve">{level}{/languageRows}</w:t>
+                    <w:t xml:space="preserve">{level}</w:t>
+                  </w:r>
+                </w:p>
+                <w:p>
+                  <w:pPr>
+                    <w:spacing w:before="0" w:after="0"/>
+                  </w:pPr>
+                  <w:r>
+                    <w:rPr>
+                      <w:color w:val="FFFFFF"/>
+                      <w:sz w:val="2"/>
+                      <w:szCs w:val="2"/>
+                    </w:rPr>
+                    <w:t>{/languageRows}</w:t>
                   </w:r>
                 </w:p>
               </w:tc>

</xml_diff>